<commit_message>
Add a NERC CIP control coverage summary so each requirement states what Secure Workload can file and what the entity still has to show.
Co-authored-by: Cursor <cursoragent@cursor.com>
</commit_message>
<xml_diff>
--- a/NERC-CIP/CSW-NERC-CIP-Compliance-Report.docx
+++ b/NERC-CIP/CSW-NERC-CIP-Compliance-Report.docx
@@ -2922,13 +2922,11 @@
       <w:r>
         <w:rPr>
           <w:b/>
-          <w:bCs/>
         </w:rPr>
-        <w:t>Posture takeaway.</w:t>
+        <w:t xml:space="preserve">Posture takeaway. </w:t>
       </w:r>
       <w:r>
-        <w:rPr/>
-        <w:t xml:space="preserve"> CSW provides direct coverage on six of the fourteen standards (CIP-005, CIP-007, CIP-008, CIP-010, CIP-013) on the IT side, supporting evidence on three more, and is structurally out of scope on the remaining five (HR, physical, OT-device-layer controls). This is consistent with CSW’s positioning as a workload- protection platform: it does the IT-side jobs well and explicitly defers OT-device and physical/HR scope to the appropriate owners.</w:t>
+        <w:t>The table above is the programme-role view: Direct, Supporting, or out of scope. It leaves out CIP-007 R5 (system access control), CIP-012 (communications between Control Centers), and CIP-015 (internal network security monitoring). The Control Coverage Summary below is the evidence view for every in-scope requirement, including those three. Full Coverage is CIP-007 R1 and CIP-010 R1 on instrumented IT-side workloads. Partial Coverage is where Secure Workload supplies one slice and another control completes the requirement. Evidence Required, with no Secure Workload artifact, is CIP-004, CIP-006, and CIP-014.</w:t>
       </w:r>
     </w:p>
     <w:p>
@@ -2996,6 +2994,1168 @@
     <w:p>
       <w:pPr>
         <w:pStyle w:val="Heading2"/>
+      </w:pPr>
+      <w:r>
+        <w:t>Control Coverage Summary</w:t>
+      </w:r>
+    </w:p>
+    <w:p>
+      <w:pPr>
+        <w:pStyle w:val="FirstParagraph"/>
+      </w:pPr>
+      <w:r>
+        <w:t>Use this table when an auditor asks what Secure Workload can put in the evidence file for each requirement. The ratings apply to IT-side workloads in the agreed scope that have a reporting sensor. They are evidence contributions. They are not a finding that the Registered Entity is compliant, and they do not make Secure Workload an Electronic Access Point or an OT control.</w:t>
+      </w:r>
+    </w:p>
+    <w:p>
+      <w:pPr>
+        <w:pStyle w:val="Compact"/>
+      </w:pPr>
+      <w:r>
+        <w:rPr>
+          <w:b/>
+        </w:rPr>
+        <w:t xml:space="preserve">Full Coverage. </w:t>
+      </w:r>
+      <w:r>
+        <w:t>On instrumented IT-side workloads, export the artifact named in the row and file it against that requirement.</w:t>
+      </w:r>
+    </w:p>
+    <w:p>
+      <w:pPr>
+        <w:pStyle w:val="Compact"/>
+      </w:pPr>
+      <w:r>
+        <w:rPr>
+          <w:b/>
+        </w:rPr>
+        <w:t xml:space="preserve">Partial Coverage. </w:t>
+      </w:r>
+      <w:r>
+        <w:t>Secure Workload covers the slice in “What Secure Workload produces.” File that export next to the record in “What the entity still files.”</w:t>
+      </w:r>
+    </w:p>
+    <w:p>
+      <w:pPr>
+        <w:pStyle w:val="Compact"/>
+      </w:pPr>
+      <w:r>
+        <w:rPr>
+          <w:b/>
+        </w:rPr>
+        <w:t xml:space="preserve">Evidence Required. </w:t>
+      </w:r>
+      <w:r>
+        <w:t>Secure Workload does not produce the record. The entity files the document from the programme that owns it.</w:t>
+      </w:r>
+    </w:p>
+    <w:tbl>
+      <w:tblPr>
+        <w:tblW w:type="auto" w:w="0"/>
+        <w:tblLook w:firstColumn="1" w:firstRow="1" w:lastColumn="0" w:lastRow="0" w:noHBand="0" w:noVBand="1" w:val="04A0"/>
+      </w:tblPr>
+      <w:tblGrid>
+        <w:gridCol w:w="2340"/>
+        <w:gridCol w:w="2340"/>
+        <w:gridCol w:w="2340"/>
+        <w:gridCol w:w="2340"/>
+      </w:tblGrid>
+      <w:tr>
+        <w:tc>
+          <w:tcPr>
+            <w:tcW w:type="dxa" w:w="2340"/>
+          </w:tcPr>
+          <w:p>
+            <w:r/>
+            <w:r>
+              <w:rPr>
+                <w:b/>
+              </w:rPr>
+              <w:t>Standard</w:t>
+            </w:r>
+          </w:p>
+        </w:tc>
+        <w:tc>
+          <w:tcPr>
+            <w:tcW w:type="dxa" w:w="2340"/>
+          </w:tcPr>
+          <w:p>
+            <w:r/>
+            <w:r>
+              <w:rPr>
+                <w:b/>
+              </w:rPr>
+              <w:t>What Secure Workload produces</w:t>
+            </w:r>
+          </w:p>
+        </w:tc>
+        <w:tc>
+          <w:tcPr>
+            <w:tcW w:type="dxa" w:w="2340"/>
+          </w:tcPr>
+          <w:p>
+            <w:r/>
+            <w:r>
+              <w:rPr>
+                <w:b/>
+              </w:rPr>
+              <w:t>What the entity still files</w:t>
+            </w:r>
+          </w:p>
+        </w:tc>
+        <w:tc>
+          <w:tcPr>
+            <w:tcW w:type="dxa" w:w="2340"/>
+          </w:tcPr>
+          <w:p>
+            <w:r/>
+            <w:r>
+              <w:rPr>
+                <w:b/>
+              </w:rPr>
+              <w:t>Coverage</w:t>
+            </w:r>
+          </w:p>
+        </w:tc>
+      </w:tr>
+      <w:tr>
+        <w:tc>
+          <w:tcPr>
+            <w:tcW w:type="dxa" w:w="2340"/>
+          </w:tcPr>
+          <w:p>
+            <w:r/>
+            <w:r>
+              <w:t>CIP-002</w:t>
+            </w:r>
+          </w:p>
+        </w:tc>
+        <w:tc>
+          <w:tcPr>
+            <w:tcW w:type="dxa" w:w="2340"/>
+          </w:tcPr>
+          <w:p>
+            <w:r/>
+            <w:r>
+              <w:t>Labelled inventory (impact, BCS id, ESP membership) that mirrors the categorisation register.</w:t>
+            </w:r>
+          </w:p>
+        </w:tc>
+        <w:tc>
+          <w:tcPr>
+            <w:tcW w:type="dxa" w:w="2340"/>
+          </w:tcPr>
+          <w:p>
+            <w:r/>
+            <w:r>
+              <w:t>The High, Medium, or Low decision against Attachment 1.</w:t>
+            </w:r>
+          </w:p>
+        </w:tc>
+        <w:tc>
+          <w:tcPr>
+            <w:tcW w:type="dxa" w:w="2340"/>
+          </w:tcPr>
+          <w:p>
+            <w:r/>
+            <w:r>
+              <w:t>Partial Coverage</w:t>
+            </w:r>
+          </w:p>
+        </w:tc>
+      </w:tr>
+      <w:tr>
+        <w:tc>
+          <w:tcPr>
+            <w:tcW w:type="dxa" w:w="2340"/>
+          </w:tcPr>
+          <w:p>
+            <w:r/>
+            <w:r>
+              <w:t>CIP-003</w:t>
+            </w:r>
+          </w:p>
+        </w:tc>
+        <w:tc>
+          <w:tcPr>
+            <w:tcW w:type="dxa" w:w="2340"/>
+          </w:tcPr>
+          <w:p>
+            <w:r/>
+            <w:r>
+              <w:t>Quarterly IT-side pack for the CIP Senior Manager: policy, ports, baseline, and vendor egress.</w:t>
+            </w:r>
+          </w:p>
+        </w:tc>
+        <w:tc>
+          <w:tcPr>
+            <w:tcW w:type="dxa" w:w="2340"/>
+          </w:tcPr>
+          <w:p>
+            <w:r/>
+            <w:r>
+              <w:t>The policies, the Senior Manager designation, and the delegations.</w:t>
+            </w:r>
+          </w:p>
+        </w:tc>
+        <w:tc>
+          <w:tcPr>
+            <w:tcW w:type="dxa" w:w="2340"/>
+          </w:tcPr>
+          <w:p>
+            <w:r/>
+            <w:r>
+              <w:t>Partial Coverage</w:t>
+            </w:r>
+          </w:p>
+        </w:tc>
+      </w:tr>
+      <w:tr>
+        <w:tc>
+          <w:tcPr>
+            <w:tcW w:type="dxa" w:w="2340"/>
+          </w:tcPr>
+          <w:p>
+            <w:r/>
+            <w:r>
+              <w:t>CIP-004</w:t>
+            </w:r>
+          </w:p>
+        </w:tc>
+        <w:tc>
+          <w:tcPr>
+            <w:tcW w:type="dxa" w:w="2340"/>
+          </w:tcPr>
+          <w:p>
+            <w:r/>
+            <w:r>
+              <w:t>No personnel record.</w:t>
+            </w:r>
+          </w:p>
+        </w:tc>
+        <w:tc>
+          <w:tcPr>
+            <w:tcW w:type="dxa" w:w="2340"/>
+          </w:tcPr>
+          <w:p>
+            <w:r/>
+            <w:r>
+              <w:t>Background checks, training, and access revocation.</w:t>
+            </w:r>
+          </w:p>
+        </w:tc>
+        <w:tc>
+          <w:tcPr>
+            <w:tcW w:type="dxa" w:w="2340"/>
+          </w:tcPr>
+          <w:p>
+            <w:r/>
+            <w:r>
+              <w:t>Evidence Required</w:t>
+            </w:r>
+          </w:p>
+        </w:tc>
+      </w:tr>
+      <w:tr>
+        <w:tc>
+          <w:tcPr>
+            <w:tcW w:type="dxa" w:w="2340"/>
+          </w:tcPr>
+          <w:p>
+            <w:r/>
+            <w:r>
+              <w:t>CIP-005 R1</w:t>
+            </w:r>
+          </w:p>
+        </w:tc>
+        <w:tc>
+          <w:tcPr>
+            <w:tcW w:type="dxa" w:w="2340"/>
+          </w:tcPr>
+          <w:p>
+            <w:r/>
+            <w:r>
+              <w:t>Deny-by-default from corporate IT up to the EAP address set, and the exception list.</w:t>
+            </w:r>
+          </w:p>
+        </w:tc>
+        <w:tc>
+          <w:tcPr>
+            <w:tcW w:type="dxa" w:w="2340"/>
+          </w:tcPr>
+          <w:p>
+            <w:r/>
+            <w:r>
+              <w:t>The EAP firewall configuration. Secure Workload is not the Electronic Access Point.</w:t>
+            </w:r>
+          </w:p>
+        </w:tc>
+        <w:tc>
+          <w:tcPr>
+            <w:tcW w:type="dxa" w:w="2340"/>
+          </w:tcPr>
+          <w:p>
+            <w:r/>
+            <w:r>
+              <w:t>Partial Coverage</w:t>
+            </w:r>
+          </w:p>
+        </w:tc>
+      </w:tr>
+      <w:tr>
+        <w:tc>
+          <w:tcPr>
+            <w:tcW w:type="dxa" w:w="2340"/>
+          </w:tcPr>
+          <w:p>
+            <w:r/>
+            <w:r>
+              <w:t>CIP-005 R2</w:t>
+            </w:r>
+          </w:p>
+        </w:tc>
+        <w:tc>
+          <w:tcPr>
+            <w:tcW w:type="dxa" w:w="2340"/>
+          </w:tcPr>
+          <w:p>
+            <w:r/>
+            <w:r>
+              <w:t>Per-session flows from the Intermediate System for the audit window.</w:t>
+            </w:r>
+          </w:p>
+        </w:tc>
+        <w:tc>
+          <w:tcPr>
+            <w:tcW w:type="dxa" w:w="2340"/>
+          </w:tcPr>
+          <w:p>
+            <w:r/>
+            <w:r>
+              <w:t>Session encryption and multi-factor authentication on the Intermediate System.</w:t>
+            </w:r>
+          </w:p>
+        </w:tc>
+        <w:tc>
+          <w:tcPr>
+            <w:tcW w:type="dxa" w:w="2340"/>
+          </w:tcPr>
+          <w:p>
+            <w:r/>
+            <w:r>
+              <w:t>Partial Coverage</w:t>
+            </w:r>
+          </w:p>
+        </w:tc>
+      </w:tr>
+      <w:tr>
+        <w:tc>
+          <w:tcPr>
+            <w:tcW w:type="dxa" w:w="2340"/>
+          </w:tcPr>
+          <w:p>
+            <w:r/>
+            <w:r>
+              <w:t>CIP-006</w:t>
+            </w:r>
+          </w:p>
+        </w:tc>
+        <w:tc>
+          <w:tcPr>
+            <w:tcW w:type="dxa" w:w="2340"/>
+          </w:tcPr>
+          <w:p>
+            <w:r/>
+            <w:r>
+              <w:t>No physical-security record.</w:t>
+            </w:r>
+          </w:p>
+        </w:tc>
+        <w:tc>
+          <w:tcPr>
+            <w:tcW w:type="dxa" w:w="2340"/>
+          </w:tcPr>
+          <w:p>
+            <w:r/>
+            <w:r>
+              <w:t>The physical security perimeter, badge access, and visitor logs.</w:t>
+            </w:r>
+          </w:p>
+        </w:tc>
+        <w:tc>
+          <w:tcPr>
+            <w:tcW w:type="dxa" w:w="2340"/>
+          </w:tcPr>
+          <w:p>
+            <w:r/>
+            <w:r>
+              <w:t>Evidence Required</w:t>
+            </w:r>
+          </w:p>
+        </w:tc>
+      </w:tr>
+      <w:tr>
+        <w:tc>
+          <w:tcPr>
+            <w:tcW w:type="dxa" w:w="2340"/>
+          </w:tcPr>
+          <w:p>
+            <w:r/>
+            <w:r>
+              <w:t>CIP-007 R1</w:t>
+            </w:r>
+          </w:p>
+        </w:tc>
+        <w:tc>
+          <w:tcPr>
+            <w:tcW w:type="dxa" w:w="2340"/>
+          </w:tcPr>
+          <w:p>
+            <w:r/>
+            <w:r>
+              <w:t>Listening-port inventory with the bound process and the last-flow time, dated at least quarterly.</w:t>
+            </w:r>
+          </w:p>
+        </w:tc>
+        <w:tc>
+          <w:tcPr>
+            <w:tcW w:type="dxa" w:w="2340"/>
+          </w:tcPr>
+          <w:p>
+            <w:r/>
+            <w:r>
+              <w:t>Tie each listener to the documented baseline.</w:t>
+            </w:r>
+          </w:p>
+        </w:tc>
+        <w:tc>
+          <w:tcPr>
+            <w:tcW w:type="dxa" w:w="2340"/>
+          </w:tcPr>
+          <w:p>
+            <w:r/>
+            <w:r>
+              <w:t>Full Coverage</w:t>
+            </w:r>
+          </w:p>
+        </w:tc>
+      </w:tr>
+      <w:tr>
+        <w:tc>
+          <w:tcPr>
+            <w:tcW w:type="dxa" w:w="2340"/>
+          </w:tcPr>
+          <w:p>
+            <w:r/>
+            <w:r>
+              <w:t>CIP-007 R2</w:t>
+            </w:r>
+          </w:p>
+        </w:tc>
+        <w:tc>
+          <w:tcPr>
+            <w:tcW w:type="dxa" w:w="2340"/>
+          </w:tcPr>
+          <w:p>
+            <w:r/>
+            <w:r>
+              <w:t>CVE and package list for software installed on the workload.</w:t>
+            </w:r>
+          </w:p>
+        </w:tc>
+        <w:tc>
+          <w:tcPr>
+            <w:tcW w:type="dxa" w:w="2340"/>
+          </w:tcPr>
+          <w:p>
+            <w:r/>
+            <w:r>
+              <w:t>The evaluation window, the patch source, and the install record. Secure Workload does not install the patch.</w:t>
+            </w:r>
+          </w:p>
+        </w:tc>
+        <w:tc>
+          <w:tcPr>
+            <w:tcW w:type="dxa" w:w="2340"/>
+          </w:tcPr>
+          <w:p>
+            <w:r/>
+            <w:r>
+              <w:t>Partial Coverage</w:t>
+            </w:r>
+          </w:p>
+        </w:tc>
+      </w:tr>
+      <w:tr>
+        <w:tc>
+          <w:tcPr>
+            <w:tcW w:type="dxa" w:w="2340"/>
+          </w:tcPr>
+          <w:p>
+            <w:r/>
+            <w:r>
+              <w:t>CIP-007 R3</w:t>
+            </w:r>
+          </w:p>
+        </w:tc>
+        <w:tc>
+          <w:tcPr>
+            <w:tcW w:type="dxa" w:w="2340"/>
+          </w:tcPr>
+          <w:p>
+            <w:r/>
+            <w:r>
+              <w:t>Behavioural-rule catalogue and the simulation-to-enforce record.</w:t>
+            </w:r>
+          </w:p>
+        </w:tc>
+        <w:tc>
+          <w:tcPr>
+            <w:tcW w:type="dxa" w:w="2340"/>
+          </w:tcPr>
+          <w:p>
+            <w:r/>
+            <w:r>
+              <w:t>The endpoint anti-malware product and its logs.</w:t>
+            </w:r>
+          </w:p>
+        </w:tc>
+        <w:tc>
+          <w:tcPr>
+            <w:tcW w:type="dxa" w:w="2340"/>
+          </w:tcPr>
+          <w:p>
+            <w:r/>
+            <w:r>
+              <w:t>Partial Coverage</w:t>
+            </w:r>
+          </w:p>
+        </w:tc>
+      </w:tr>
+      <w:tr>
+        <w:tc>
+          <w:tcPr>
+            <w:tcW w:type="dxa" w:w="2340"/>
+          </w:tcPr>
+          <w:p>
+            <w:r/>
+            <w:r>
+              <w:t>CIP-007 R4</w:t>
+            </w:r>
+          </w:p>
+        </w:tc>
+        <w:tc>
+          <w:tcPr>
+            <w:tcW w:type="dxa" w:w="2340"/>
+          </w:tcPr>
+          <w:p>
+            <w:r/>
+            <w:r>
+              <w:t>Process and flow telemetry forwarded to the SIEM.</w:t>
+            </w:r>
+          </w:p>
+        </w:tc>
+        <w:tc>
+          <w:tcPr>
+            <w:tcW w:type="dxa" w:w="2340"/>
+          </w:tcPr>
+          <w:p>
+            <w:r/>
+            <w:r>
+              <w:t>The alert procedure, the review log, and the retention attestation.</w:t>
+            </w:r>
+          </w:p>
+        </w:tc>
+        <w:tc>
+          <w:tcPr>
+            <w:tcW w:type="dxa" w:w="2340"/>
+          </w:tcPr>
+          <w:p>
+            <w:r/>
+            <w:r>
+              <w:t>Partial Coverage</w:t>
+            </w:r>
+          </w:p>
+        </w:tc>
+      </w:tr>
+      <w:tr>
+        <w:tc>
+          <w:tcPr>
+            <w:tcW w:type="dxa" w:w="2340"/>
+          </w:tcPr>
+          <w:p>
+            <w:r/>
+            <w:r>
+              <w:t>CIP-007 R5</w:t>
+            </w:r>
+          </w:p>
+        </w:tc>
+        <w:tc>
+          <w:tcPr>
+            <w:tcW w:type="dxa" w:w="2340"/>
+          </w:tcPr>
+          <w:p>
+            <w:r/>
+            <w:r>
+              <w:t>Policy that limits which workloads can reach the authentication services. This requirement was not in the posture table above.</w:t>
+            </w:r>
+          </w:p>
+        </w:tc>
+        <w:tc>
+          <w:tcPr>
+            <w:tcW w:type="dxa" w:w="2340"/>
+          </w:tcPr>
+          <w:p>
+            <w:r/>
+            <w:r>
+              <w:t>Account inventory, passwords, and multi-factor authentication.</w:t>
+            </w:r>
+          </w:p>
+        </w:tc>
+        <w:tc>
+          <w:tcPr>
+            <w:tcW w:type="dxa" w:w="2340"/>
+          </w:tcPr>
+          <w:p>
+            <w:r/>
+            <w:r>
+              <w:t>Partial Coverage</w:t>
+            </w:r>
+          </w:p>
+        </w:tc>
+      </w:tr>
+      <w:tr>
+        <w:tc>
+          <w:tcPr>
+            <w:tcW w:type="dxa" w:w="2340"/>
+          </w:tcPr>
+          <w:p>
+            <w:r/>
+            <w:r>
+              <w:t>CIP-008</w:t>
+            </w:r>
+          </w:p>
+        </w:tc>
+        <w:tc>
+          <w:tcPr>
+            <w:tcW w:type="dxa" w:w="2340"/>
+          </w:tcPr>
+          <w:p>
+            <w:r/>
+            <w:r>
+              <w:t>Six-artefact reconstruction bundle for the incident window: flows, processes, policy verdicts, and hosts touched.</w:t>
+            </w:r>
+          </w:p>
+        </w:tc>
+        <w:tc>
+          <w:tcPr>
+            <w:tcW w:type="dxa" w:w="2340"/>
+          </w:tcPr>
+          <w:p>
+            <w:r/>
+            <w:r>
+              <w:t>The response plan, the plan test, and the E-ISAC notification.</w:t>
+            </w:r>
+          </w:p>
+        </w:tc>
+        <w:tc>
+          <w:tcPr>
+            <w:tcW w:type="dxa" w:w="2340"/>
+          </w:tcPr>
+          <w:p>
+            <w:r/>
+            <w:r>
+              <w:t>Partial Coverage</w:t>
+            </w:r>
+          </w:p>
+        </w:tc>
+      </w:tr>
+      <w:tr>
+        <w:tc>
+          <w:tcPr>
+            <w:tcW w:type="dxa" w:w="2340"/>
+          </w:tcPr>
+          <w:p>
+            <w:r/>
+            <w:r>
+              <w:t>CIP-009</w:t>
+            </w:r>
+          </w:p>
+        </w:tc>
+        <w:tc>
+          <w:tcPr>
+            <w:tcW w:type="dxa" w:w="2340"/>
+          </w:tcPr>
+          <w:p>
+            <w:r/>
+            <w:r>
+              <w:t>Policy workspace and configuration baseline as a known-good IT-side state.</w:t>
+            </w:r>
+          </w:p>
+        </w:tc>
+        <w:tc>
+          <w:tcPr>
+            <w:tcW w:type="dxa" w:w="2340"/>
+          </w:tcPr>
+          <w:p>
+            <w:r/>
+            <w:r>
+              <w:t>Backup execution and the recovery test.</w:t>
+            </w:r>
+          </w:p>
+        </w:tc>
+        <w:tc>
+          <w:tcPr>
+            <w:tcW w:type="dxa" w:w="2340"/>
+          </w:tcPr>
+          <w:p>
+            <w:r/>
+            <w:r>
+              <w:t>Partial Coverage</w:t>
+            </w:r>
+          </w:p>
+        </w:tc>
+      </w:tr>
+      <w:tr>
+        <w:tc>
+          <w:tcPr>
+            <w:tcW w:type="dxa" w:w="2340"/>
+          </w:tcPr>
+          <w:p>
+            <w:r/>
+            <w:r>
+              <w:t>CIP-010 R1</w:t>
+            </w:r>
+          </w:p>
+        </w:tc>
+        <w:tc>
+          <w:tcPr>
+            <w:tcW w:type="dxa" w:w="2340"/>
+          </w:tcPr>
+          <w:p>
+            <w:r/>
+            <w:r>
+              <w:t>Daily software and listening-port baseline, the diff, and a disposition against the change ticket.</w:t>
+            </w:r>
+          </w:p>
+        </w:tc>
+        <w:tc>
+          <w:tcPr>
+            <w:tcW w:type="dxa" w:w="2340"/>
+          </w:tcPr>
+          <w:p>
+            <w:r/>
+            <w:r>
+              <w:t>The change ticket itself. A change seen here and absent from a ticket is the unauthorised-change candidate.</w:t>
+            </w:r>
+          </w:p>
+        </w:tc>
+        <w:tc>
+          <w:tcPr>
+            <w:tcW w:type="dxa" w:w="2340"/>
+          </w:tcPr>
+          <w:p>
+            <w:r/>
+            <w:r>
+              <w:t>Full Coverage</w:t>
+            </w:r>
+          </w:p>
+        </w:tc>
+      </w:tr>
+      <w:tr>
+        <w:tc>
+          <w:tcPr>
+            <w:tcW w:type="dxa" w:w="2340"/>
+          </w:tcPr>
+          <w:p>
+            <w:r/>
+            <w:r>
+              <w:t>CIP-010 R3</w:t>
+            </w:r>
+          </w:p>
+        </w:tc>
+        <w:tc>
+          <w:tcPr>
+            <w:tcW w:type="dxa" w:w="2340"/>
+          </w:tcPr>
+          <w:p>
+            <w:r/>
+            <w:r>
+              <w:t>Per-workload CVE inventory.</w:t>
+            </w:r>
+          </w:p>
+        </w:tc>
+        <w:tc>
+          <w:tcPr>
+            <w:tcW w:type="dxa" w:w="2340"/>
+          </w:tcPr>
+          <w:p>
+            <w:r/>
+            <w:r>
+              <w:t>The entity's active assessment method, the cadence by impact rating, and the mitigation record.</w:t>
+            </w:r>
+          </w:p>
+        </w:tc>
+        <w:tc>
+          <w:tcPr>
+            <w:tcW w:type="dxa" w:w="2340"/>
+          </w:tcPr>
+          <w:p>
+            <w:r/>
+            <w:r>
+              <w:t>Partial Coverage</w:t>
+            </w:r>
+          </w:p>
+        </w:tc>
+      </w:tr>
+      <w:tr>
+        <w:tc>
+          <w:tcPr>
+            <w:tcW w:type="dxa" w:w="2340"/>
+          </w:tcPr>
+          <w:p>
+            <w:r/>
+            <w:r>
+              <w:t>CIP-011</w:t>
+            </w:r>
+          </w:p>
+        </w:tc>
+        <w:tc>
+          <w:tcPr>
+            <w:tcW w:type="dxa" w:w="2340"/>
+          </w:tcPr>
+          <w:p>
+            <w:r/>
+            <w:r>
+              <w:t>Egress and access-pattern report for hosts labelled as BCSI hosts.</w:t>
+            </w:r>
+          </w:p>
+        </w:tc>
+        <w:tc>
+          <w:tcPr>
+            <w:tcW w:type="dxa" w:w="2340"/>
+          </w:tcPr>
+          <w:p>
+            <w:r/>
+            <w:r>
+              <w:t>Classification, storage, transit, and disposal of BES Cyber System Information.</w:t>
+            </w:r>
+          </w:p>
+        </w:tc>
+        <w:tc>
+          <w:tcPr>
+            <w:tcW w:type="dxa" w:w="2340"/>
+          </w:tcPr>
+          <w:p>
+            <w:r/>
+            <w:r>
+              <w:t>Partial Coverage</w:t>
+            </w:r>
+          </w:p>
+        </w:tc>
+      </w:tr>
+      <w:tr>
+        <w:tc>
+          <w:tcPr>
+            <w:tcW w:type="dxa" w:w="2340"/>
+          </w:tcPr>
+          <w:p>
+            <w:r/>
+            <w:r>
+              <w:t>CIP-012</w:t>
+            </w:r>
+          </w:p>
+        </w:tc>
+        <w:tc>
+          <w:tcPr>
+            <w:tcW w:type="dxa" w:w="2340"/>
+          </w:tcPr>
+          <w:p>
+            <w:r/>
+            <w:r>
+              <w:t>Observed paths, and an allowlist, for instrumented control-center workloads that exchange real-time assessment or monitoring data. This standard was not in the posture table above.</w:t>
+            </w:r>
+          </w:p>
+        </w:tc>
+        <w:tc>
+          <w:tcPr>
+            <w:tcW w:type="dxa" w:w="2340"/>
+          </w:tcPr>
+          <w:p>
+            <w:r/>
+            <w:r>
+              <w:t>Identification of that real-time data, the protection method on the control-center link, and the CIP-012 plan. Secure Workload does not encrypt that link.</w:t>
+            </w:r>
+          </w:p>
+        </w:tc>
+        <w:tc>
+          <w:tcPr>
+            <w:tcW w:type="dxa" w:w="2340"/>
+          </w:tcPr>
+          <w:p>
+            <w:r/>
+            <w:r>
+              <w:t>Partial Coverage</w:t>
+            </w:r>
+          </w:p>
+        </w:tc>
+      </w:tr>
+      <w:tr>
+        <w:tc>
+          <w:tcPr>
+            <w:tcW w:type="dxa" w:w="2340"/>
+          </w:tcPr>
+          <w:p>
+            <w:r/>
+            <w:r>
+              <w:t>CIP-013</w:t>
+            </w:r>
+          </w:p>
+        </w:tc>
+        <w:tc>
+          <w:tcPr>
+            <w:tcW w:type="dxa" w:w="2340"/>
+          </w:tcPr>
+          <w:p>
+            <w:r/>
+            <w:r>
+              <w:t>Vendor-egress flows reconciled to the vendor register, and the allowlist on electronic access systems.</w:t>
+            </w:r>
+          </w:p>
+        </w:tc>
+        <w:tc>
+          <w:tcPr>
+            <w:tcW w:type="dxa" w:w="2340"/>
+          </w:tcPr>
+          <w:p>
+            <w:r/>
+            <w:r>
+              <w:t>The supply-chain risk plan and the vendor contract clauses.</w:t>
+            </w:r>
+          </w:p>
+        </w:tc>
+        <w:tc>
+          <w:tcPr>
+            <w:tcW w:type="dxa" w:w="2340"/>
+          </w:tcPr>
+          <w:p>
+            <w:r/>
+            <w:r>
+              <w:t>Partial Coverage</w:t>
+            </w:r>
+          </w:p>
+        </w:tc>
+      </w:tr>
+      <w:tr>
+        <w:tc>
+          <w:tcPr>
+            <w:tcW w:type="dxa" w:w="2340"/>
+          </w:tcPr>
+          <w:p>
+            <w:r/>
+            <w:r>
+              <w:t>CIP-014</w:t>
+            </w:r>
+          </w:p>
+        </w:tc>
+        <w:tc>
+          <w:tcPr>
+            <w:tcW w:type="dxa" w:w="2340"/>
+          </w:tcPr>
+          <w:p>
+            <w:r/>
+            <w:r>
+              <w:t>No physical-security record.</w:t>
+            </w:r>
+          </w:p>
+        </w:tc>
+        <w:tc>
+          <w:tcPr>
+            <w:tcW w:type="dxa" w:w="2340"/>
+          </w:tcPr>
+          <w:p>
+            <w:r/>
+            <w:r>
+              <w:t>Transmission-station physical security.</w:t>
+            </w:r>
+          </w:p>
+        </w:tc>
+        <w:tc>
+          <w:tcPr>
+            <w:tcW w:type="dxa" w:w="2340"/>
+          </w:tcPr>
+          <w:p>
+            <w:r/>
+            <w:r>
+              <w:t>Evidence Required</w:t>
+            </w:r>
+          </w:p>
+        </w:tc>
+      </w:tr>
+      <w:tr>
+        <w:tc>
+          <w:tcPr>
+            <w:tcW w:type="dxa" w:w="2340"/>
+          </w:tcPr>
+          <w:p>
+            <w:r/>
+            <w:r>
+              <w:t>CIP-015</w:t>
+            </w:r>
+          </w:p>
+        </w:tc>
+        <w:tc>
+          <w:tcPr>
+            <w:tcW w:type="dxa" w:w="2340"/>
+          </w:tcPr>
+          <w:p>
+            <w:r/>
+            <w:r>
+              <w:t>East-west flow and process telemetry on instrumented IT-side hosts, as an input to internal network security monitoring. Confirm the effective date for the entity's impact rating before an audit cites this row.</w:t>
+            </w:r>
+          </w:p>
+        </w:tc>
+        <w:tc>
+          <w:tcPr>
+            <w:tcW w:type="dxa" w:w="2340"/>
+          </w:tcPr>
+          <w:p>
+            <w:r/>
+            <w:r>
+              <w:t>Monitoring on OT segments and on hosts with no sensor.</w:t>
+            </w:r>
+          </w:p>
+        </w:tc>
+        <w:tc>
+          <w:tcPr>
+            <w:tcW w:type="dxa" w:w="2340"/>
+          </w:tcPr>
+          <w:p>
+            <w:r/>
+            <w:r>
+              <w:t>Partial Coverage</w:t>
+            </w:r>
+          </w:p>
+        </w:tc>
+      </w:tr>
+      <w:tr>
+        <w:tc>
+          <w:tcPr>
+            <w:tcW w:type="dxa" w:w="2340"/>
+          </w:tcPr>
+          <w:p>
+            <w:r>
+              <w:t>CIP-007 R5 (system access control)</w:t>
+            </w:r>
+          </w:p>
+        </w:tc>
+        <w:tc>
+          <w:tcPr>
+            <w:tcW w:type="dxa" w:w="2340"/>
+          </w:tcPr>
+          <w:p>
+            <w:r>
+              <w:t>Policy restricting which workloads can reach authentication services</w:t>
+            </w:r>
+          </w:p>
+        </w:tc>
+        <w:tc>
+          <w:tcPr>
+            <w:tcW w:type="dxa" w:w="2340"/>
+          </w:tcPr>
+          <w:p>
+            <w:r>
+              <w:t>Authentication-path policy export, filed with the identity-system account and MFA evidence</w:t>
+            </w:r>
+          </w:p>
+        </w:tc>
+        <w:tc>
+          <w:tcPr>
+            <w:tcW w:type="dxa" w:w="2340"/>
+          </w:tcPr>
+          <w:p/>
+        </w:tc>
+      </w:tr>
+      <w:tr>
+        <w:tc>
+          <w:tcPr>
+            <w:tcW w:type="dxa" w:w="2340"/>
+          </w:tcPr>
+          <w:p>
+            <w:r>
+              <w:t>CIP-012 R1 (control-center communications)</w:t>
+            </w:r>
+          </w:p>
+        </w:tc>
+        <w:tc>
+          <w:tcPr>
+            <w:tcW w:type="dxa" w:w="2340"/>
+          </w:tcPr>
+          <w:p>
+            <w:r>
+              <w:t>Observed flows and an allowlist between instrumented control-center workloads that carry real-time data</w:t>
+            </w:r>
+          </w:p>
+        </w:tc>
+        <w:tc>
+          <w:tcPr>
+            <w:tcW w:type="dxa" w:w="2340"/>
+          </w:tcPr>
+          <w:p>
+            <w:r>
+              <w:t>Flow export and allowlist, filed with the CIP-012 plan and the link-protection record</w:t>
+            </w:r>
+          </w:p>
+        </w:tc>
+        <w:tc>
+          <w:tcPr>
+            <w:tcW w:type="dxa" w:w="2340"/>
+          </w:tcPr>
+          <w:p/>
+        </w:tc>
+      </w:tr>
+      <w:tr>
+        <w:tc>
+          <w:tcPr>
+            <w:tcW w:type="dxa" w:w="2340"/>
+          </w:tcPr>
+          <w:p>
+            <w:r>
+              <w:t>CIP-015 (internal network security monitoring)</w:t>
+            </w:r>
+          </w:p>
+        </w:tc>
+        <w:tc>
+          <w:tcPr>
+            <w:tcW w:type="dxa" w:w="2340"/>
+          </w:tcPr>
+          <w:p>
+            <w:r>
+              <w:t>East-west flow and process telemetry on instrumented IT-side hosts</w:t>
+            </w:r>
+          </w:p>
+        </w:tc>
+        <w:tc>
+          <w:tcPr>
+            <w:tcW w:type="dxa" w:w="2340"/>
+          </w:tcPr>
+          <w:p>
+            <w:r>
+              <w:t>Telemetry export for the monitored segment, after the entity confirms CIP-015 applies</w:t>
+            </w:r>
+          </w:p>
+        </w:tc>
+        <w:tc>
+          <w:tcPr>
+            <w:tcW w:type="dxa" w:w="2340"/>
+          </w:tcPr>
+          <w:p/>
+        </w:tc>
+      </w:tr>
+    </w:tbl>
+    <w:p>
+      <w:pPr>
+        <w:pStyle w:val="Heading2"/>
         <w:rPr/>
       </w:pPr>
       <w:bookmarkStart w:id="4" w:name="X470be95cef125936a0c59deeb4f44099a333a6d"/>
@@ -5359,6 +6519,70 @@
                 <w:lang w:val="en-US" w:eastAsia="zh-CN" w:bidi="ar-SA"/>
               </w:rPr>
               <w:t>Per-incident vendor flow extract</w:t>
+            </w:r>
+          </w:p>
+        </w:tc>
+      </w:tr>
+      <w:tr>
+        <w:tc>
+          <w:tcPr>
+            <w:tcW w:type="dxa" w:w="3120"/>
+          </w:tcPr>
+          <w:p>
+            <w:r>
+              <w:t>CIP-012 link protection</w:t>
+            </w:r>
+          </w:p>
+        </w:tc>
+        <w:tc>
+          <w:tcPr>
+            <w:tcW w:type="dxa" w:w="3120"/>
+          </w:tcPr>
+          <w:p>
+            <w:r>
+              <w:t>Control-center communications owner</w:t>
+            </w:r>
+          </w:p>
+        </w:tc>
+        <w:tc>
+          <w:tcPr>
+            <w:tcW w:type="dxa" w:w="3120"/>
+          </w:tcPr>
+          <w:p>
+            <w:r>
+              <w:t>Identification of real-time data and protection of the control-center link. Secure Workload shows the path; it does not encrypt it.</w:t>
+            </w:r>
+          </w:p>
+        </w:tc>
+      </w:tr>
+      <w:tr>
+        <w:tc>
+          <w:tcPr>
+            <w:tcW w:type="dxa" w:w="3120"/>
+          </w:tcPr>
+          <w:p>
+            <w:r>
+              <w:t>CIP-015 on OT segments</w:t>
+            </w:r>
+          </w:p>
+        </w:tc>
+        <w:tc>
+          <w:tcPr>
+            <w:tcW w:type="dxa" w:w="3120"/>
+          </w:tcPr>
+          <w:p>
+            <w:r>
+              <w:t>OT/ICS team</w:t>
+            </w:r>
+          </w:p>
+        </w:tc>
+        <w:tc>
+          <w:tcPr>
+            <w:tcW w:type="dxa" w:w="3120"/>
+          </w:tcPr>
+          <w:p>
+            <w:r>
+              <w:t>Internal network security monitoring on segments with no Secure Workload sensor, including Level 0–2 networks.</w:t>
             </w:r>
           </w:p>
         </w:tc>

</xml_diff>